<commit_message>
fix: add 一、开场 section heading, regenerate docx
</commit_message>
<xml_diff>
--- a/分析结论/04-报告讲稿.docx
+++ b/分析结论/04-报告讲稿.docx
@@ -8,6 +8,14 @@
       </w:pPr>
       <w:r>
         <w:t xml:space="preserve">&amp;quot;你…还向往吗？&amp;quot;——当代大学生婚恋观调查报告讲稿</w:t>
+      </w:r>
+    </w:p>
+    <w:p>
+      <w:pPr>
+        <w:pStyle w:val="Heading2"/>
+      </w:pPr>
+      <w:r>
+        <w:t xml:space="preserve">一、开场</w:t>
       </w:r>
     </w:p>
     <w:p>

</xml_diff>